<commit_message>
Barranquita: caratula con la foto aerea del local en los seis documentos
Modulo caratula_b (Word, especificaciones, Excel openpyxl y UNO) con entidad, proyecto, C.I.,
foto, titulo del documento, especialidad, ubicacion y fecha. Metrado, calculos y planos sin cambios.

Co-Authored-By: Claude Opus 5.5 <noreply@anthropic.com>
Claude-Session: https://claude.ai/code/session_0142t8T16igb3VKxUPwnQPq6
</commit_message>
<xml_diff>
--- a/entregables_barranquita/ESPECIFICACIONES_TECNICAS_DRENAJE_PLUVIAL_IE0590_BARRANQUITA.docx
+++ b/entregables_barranquita/ESPECIFICACIONES_TECNICAS_DRENAJE_PLUVIAL_IE0590_BARRANQUITA.docx
@@ -4,21 +4,7 @@
   <w:body>
     <w:p>
       <w:pPr>
-        <w:spacing w:after="1400" w:before="0" w:line="276"/>
-        <w:jc w:val="both"/>
-      </w:pPr>
-      <w:r>
-        <w:rPr>
-          <w:rFonts w:ascii="Arial" w:cs="Arial" w:eastAsia="Arial" w:hAnsi="Arial"/>
-          <w:sz w:val="20"/>
-          <w:szCs w:val="20"/>
-        </w:rPr>
-        <w:t xml:space="preserve"/>
-      </w:r>
-    </w:p>
-    <w:p>
-      <w:pPr>
-        <w:spacing w:after="600" w:before="0" w:line="276"/>
+        <w:spacing w:after="0" w:before="0" w:line="276"/>
         <w:jc w:val="center"/>
       </w:pPr>
       <w:r>
@@ -26,15 +12,53 @@
           <w:rFonts w:ascii="Arial" w:cs="Arial" w:eastAsia="Arial" w:hAnsi="Arial"/>
           <w:b/>
           <w:bCs/>
+          <w:color w:val="1F3864"/>
+          <w:sz w:val="30"/>
+          <w:szCs w:val="30"/>
+        </w:rPr>
+        <w:t xml:space="preserve">GOBIERNO REGIONAL SAN MARTÍN</w:t>
+      </w:r>
+    </w:p>
+    <w:p>
+      <w:pPr>
+        <w:pBdr>
+          <w:bottom w:val="single" w:color="1F3864" w:sz="12" w:space="4"/>
+        </w:pBdr>
+        <w:spacing w:after="160"/>
+        <w:jc w:val="center"/>
+      </w:pPr>
+      <w:r>
+        <w:rPr>
+          <w:rFonts w:ascii="Arial" w:cs="Arial" w:eastAsia="Arial" w:hAnsi="Arial"/>
+          <w:b/>
+          <w:bCs/>
+          <w:color w:val="595959"/>
+          <w:sz w:val="22"/>
+          <w:szCs w:val="22"/>
+        </w:rPr>
+        <w:t xml:space="preserve">GERENCIA TERRITORIAL BAJO MAYO - TARAPOTO</w:t>
+      </w:r>
+    </w:p>
+    <w:p>
+      <w:pPr>
+        <w:spacing w:after="80" w:before="0" w:line="276"/>
+        <w:jc w:val="center"/>
+      </w:pPr>
+      <w:r>
+        <w:rPr>
+          <w:rFonts w:ascii="Arial" w:cs="Arial" w:eastAsia="Arial" w:hAnsi="Arial"/>
+          <w:b/>
+          <w:bCs/>
+          <w:color w:val="1F3864"/>
           <w:sz w:val="24"/>
           <w:szCs w:val="24"/>
         </w:rPr>
-        <w:t xml:space="preserve">GOBIERNO REGIONAL SAN MARTIN - GERENCIA TERRITORIAL BAJO MAYO - TARAPOTO</w:t>
-      </w:r>
-    </w:p>
-    <w:p>
-      <w:pPr>
-        <w:spacing w:after="200" w:before="0" w:line="276"/>
+        <w:t xml:space="preserve">EXPEDIENTE TÉCNICO</w:t>
+      </w:r>
+    </w:p>
+    <w:p>
+      <w:pPr>
+        <w:spacing w:after="40" w:before="0" w:line="276"/>
         <w:jc w:val="center"/>
       </w:pPr>
       <w:r>
@@ -42,16 +66,15 @@
           <w:rFonts w:ascii="Arial" w:cs="Arial" w:eastAsia="Arial" w:hAnsi="Arial"/>
           <w:b/>
           <w:bCs/>
-          <w:color w:val="1F3864"/>
-          <w:sz w:val="26"/>
-          <w:szCs w:val="26"/>
-        </w:rPr>
-        <w:t xml:space="preserve">EXPEDIENTE TÉCNICO</w:t>
-      </w:r>
-    </w:p>
-    <w:p>
-      <w:pPr>
-        <w:spacing w:after="200" w:before="0" w:line="276"/>
+          <w:sz w:val="23"/>
+          <w:szCs w:val="23"/>
+        </w:rPr>
+        <w:t xml:space="preserve">“MEJORAMIENTO Y AMPLIACIÓN DEL SERVICIO DE EDUCACIÓN PRIMARIA EN I.E. N° 0590 DISTRITO DE BARRANQUITA DE LA PROVINCIA DE LAMAS DEL DEPARTAMENTO DE SAN MARTÍN”</w:t>
+      </w:r>
+    </w:p>
+    <w:p>
+      <w:pPr>
+        <w:spacing w:after="160" w:before="0" w:line="276"/>
         <w:jc w:val="center"/>
       </w:pPr>
       <w:r>
@@ -60,100 +83,187 @@
           <w:b/>
           <w:bCs/>
           <w:color w:val="1F3864"/>
-          <w:sz w:val="40"/>
-          <w:szCs w:val="40"/>
-        </w:rPr>
-        <w:t xml:space="preserve">ESPECIFICACIONES TÉCNICAS</w:t>
-      </w:r>
-    </w:p>
-    <w:p>
-      <w:pPr>
-        <w:spacing w:after="900" w:before="0" w:line="276"/>
+          <w:sz w:val="22"/>
+          <w:szCs w:val="22"/>
+        </w:rPr>
+        <w:t xml:space="preserve">C.I. N° 468901</w:t>
+      </w:r>
+    </w:p>
+    <w:p>
+      <w:pPr>
         <w:jc w:val="center"/>
       </w:pPr>
       <w:r>
-        <w:rPr>
-          <w:rFonts w:ascii="Arial" w:cs="Arial" w:eastAsia="Arial" w:hAnsi="Arial"/>
-          <w:b/>
-          <w:bCs/>
+        <w:drawing>
+          <wp:inline distT="0" distB="0" distL="0" distR="0">
+            <wp:extent cx="5581650" cy="4143375"/>
+            <wp:effectExtent t="0" r="0" b="0" l="0"/>
+            <wp:docPr id="1" name="" descr="" title=""/>
+            <wp:cNvGraphicFramePr>
+              <a:graphicFrameLocks xmlns:a="http://schemas.openxmlformats.org/drawingml/2006/main" noChangeAspect="1"/>
+            </wp:cNvGraphicFramePr>
+            <a:graphic xmlns:a="http://schemas.openxmlformats.org/drawingml/2006/main">
+              <a:graphicData uri="http://schemas.openxmlformats.org/drawingml/2006/picture">
+                <pic:pic xmlns:pic="http://schemas.openxmlformats.org/drawingml/2006/picture">
+                  <pic:nvPicPr>
+                    <pic:cNvPr id="0" name="" descr=""/>
+                    <pic:cNvPicPr>
+                      <a:picLocks noChangeAspect="1" noChangeArrowheads="1"/>
+                    </pic:cNvPicPr>
+                  </pic:nvPicPr>
+                  <pic:blipFill>
+                    <a:blip r:embed="rId9" cstate="none"/>
+                    <a:srcRect/>
+                    <a:stretch>
+                      <a:fillRect/>
+                    </a:stretch>
+                  </pic:blipFill>
+                  <pic:spPr bwMode="auto">
+                    <a:xfrm>
+                      <a:off x="0" y="0"/>
+                      <a:ext cx="5581650" cy="4143375"/>
+                    </a:xfrm>
+                    <a:prstGeom prst="rect">
+                      <a:avLst/>
+                    </a:prstGeom>
+                  </pic:spPr>
+                </pic:pic>
+              </a:graphicData>
+            </a:graphic>
+          </wp:inline>
+        </w:drawing>
+      </w:r>
+    </w:p>
+    <w:p>
+      <w:pPr>
+        <w:spacing w:after="160" w:before="0" w:line="276"/>
+        <w:jc w:val="center"/>
+      </w:pPr>
+      <w:r>
+        <w:rPr>
+          <w:rFonts w:ascii="Arial" w:cs="Arial" w:eastAsia="Arial" w:hAnsi="Arial"/>
+          <w:i/>
+          <w:iCs/>
+          <w:color w:val="595959"/>
+          <w:sz w:val="16"/>
+          <w:szCs w:val="16"/>
+        </w:rPr>
+        <w:t xml:space="preserve">Vista aérea del local de la I.E. N° 0590 - Barranquita</w:t>
+      </w:r>
+    </w:p>
+    <w:tbl>
+      <w:tblPr>
+        <w:tblW w:type="dxa" w:w="9071"/>
+        <w:jc w:val="center"/>
+        <w:tblBorders>
+          <w:top w:val="single" w:color="auto" w:sz="4"/>
+          <w:left w:val="single" w:color="auto" w:sz="4"/>
+          <w:bottom w:val="single" w:color="auto" w:sz="4"/>
+          <w:right w:val="single" w:color="auto" w:sz="4"/>
+          <w:insideH w:val="single" w:color="auto" w:sz="4"/>
+          <w:insideV w:val="single" w:color="auto" w:sz="4"/>
+        </w:tblBorders>
+      </w:tblPr>
+      <w:tblGrid>
+        <w:gridCol w:w="9071"/>
+      </w:tblGrid>
+      <w:tr>
+        <w:tc>
+          <w:tcPr>
+            <w:tcW w:type="dxa" w:w="9071"/>
+            <w:tcBorders>
+              <w:top w:val="none" w:color="FFFFFF" w:sz="0"/>
+              <w:left w:val="none" w:color="FFFFFF" w:sz="0"/>
+              <w:bottom w:val="none" w:color="FFFFFF" w:sz="0"/>
+              <w:right w:val="none" w:color="FFFFFF" w:sz="0"/>
+            </w:tcBorders>
+            <w:shd w:fill="1F3864" w:color="auto" w:val="clear"/>
+            <w:tcMar>
+              <w:top w:type="dxa" w:w="120"/>
+              <w:left w:type="dxa" w:w="120"/>
+              <w:bottom w:type="dxa" w:w="120"/>
+              <w:right w:type="dxa" w:w="120"/>
+            </w:tcMar>
+          </w:tcPr>
+          <w:p>
+            <w:pPr>
+              <w:spacing w:after="40"/>
+              <w:jc w:val="center"/>
+            </w:pPr>
+            <w:r>
+              <w:rPr>
+                <w:rFonts w:ascii="Arial" w:cs="Arial" w:eastAsia="Arial" w:hAnsi="Arial"/>
+                <w:b/>
+                <w:bCs/>
+                <w:color w:val="FFFFFF"/>
+                <w:sz w:val="40"/>
+                <w:szCs w:val="40"/>
+              </w:rPr>
+              <w:t xml:space="preserve">ESPECIFICACIONES TÉCNICAS</w:t>
+            </w:r>
+          </w:p>
+          <w:p>
+            <w:pPr>
+              <w:jc w:val="center"/>
+            </w:pPr>
+            <w:r>
+              <w:rPr>
+                <w:rFonts w:ascii="Arial" w:cs="Arial" w:eastAsia="Arial" w:hAnsi="Arial"/>
+                <w:b/>
+                <w:bCs/>
+                <w:color w:val="FFFFFF"/>
+                <w:sz w:val="22"/>
+                <w:szCs w:val="22"/>
+              </w:rPr>
+              <w:t xml:space="preserve">DRENAJE PLUVIAL - RED DE CUNETAS</w:t>
+            </w:r>
+          </w:p>
+        </w:tc>
+      </w:tr>
+    </w:tbl>
+    <w:p>
+      <w:pPr>
+        <w:spacing w:after="40" w:before="200" w:line="276"/>
+        <w:jc w:val="center"/>
+      </w:pPr>
+      <w:r>
+        <w:rPr>
+          <w:rFonts w:ascii="Arial" w:cs="Arial" w:eastAsia="Arial" w:hAnsi="Arial"/>
+          <w:b/>
+          <w:bCs/>
+          <w:sz w:val="21"/>
+          <w:szCs w:val="21"/>
+        </w:rPr>
+        <w:t xml:space="preserve">ESPECIALIDAD: INSTALACIONES SANITARIAS - DRENAJE PLUVIAL</w:t>
+      </w:r>
+    </w:p>
+    <w:p>
+      <w:pPr>
+        <w:spacing w:after="160" w:before="0" w:line="276"/>
+        <w:jc w:val="center"/>
+      </w:pPr>
+      <w:r>
+        <w:rPr>
+          <w:rFonts w:ascii="Arial" w:cs="Arial" w:eastAsia="Arial" w:hAnsi="Arial"/>
+          <w:sz w:val="20"/>
+          <w:szCs w:val="20"/>
+        </w:rPr>
+        <w:t xml:space="preserve">Distrito de Barranquita  -  Provincia de Lamas  -  Departamento de San Martín</w:t>
+      </w:r>
+    </w:p>
+    <w:p>
+      <w:pPr>
+        <w:spacing w:after="100" w:before="0" w:line="276"/>
+        <w:jc w:val="center"/>
+      </w:pPr>
+      <w:r>
+        <w:rPr>
+          <w:rFonts w:ascii="Arial" w:cs="Arial" w:eastAsia="Arial" w:hAnsi="Arial"/>
+          <w:b/>
+          <w:bCs/>
+          <w:color w:val="1F3864"/>
           <w:sz w:val="24"/>
           <w:szCs w:val="24"/>
-        </w:rPr>
-        <w:t xml:space="preserve">ESPECIALIDAD: INSTALACIONES SANITARIAS - DRENAJE PLUVIAL</w:t>
-      </w:r>
-    </w:p>
-    <w:p>
-      <w:pPr>
-        <w:spacing w:after="120" w:before="0" w:line="276"/>
-        <w:jc w:val="center"/>
-      </w:pPr>
-      <w:r>
-        <w:rPr>
-          <w:rFonts w:ascii="Arial" w:cs="Arial" w:eastAsia="Arial" w:hAnsi="Arial"/>
-          <w:b/>
-          <w:bCs/>
-          <w:sz w:val="20"/>
-          <w:szCs w:val="20"/>
-        </w:rPr>
-        <w:t xml:space="preserve">PROYECTO:</w:t>
-      </w:r>
-    </w:p>
-    <w:p>
-      <w:pPr>
-        <w:spacing w:after="300" w:before="0" w:line="276"/>
-        <w:jc w:val="center"/>
-      </w:pPr>
-      <w:r>
-        <w:rPr>
-          <w:rFonts w:ascii="Arial" w:cs="Arial" w:eastAsia="Arial" w:hAnsi="Arial"/>
-          <w:sz w:val="22"/>
-          <w:szCs w:val="22"/>
-        </w:rPr>
-        <w:t xml:space="preserve">MEJORAMIENTO Y AMPLIACIÓN DEL SERVICIO DE EDUCACIÓN PRIMARIA EN I.E. N° 0590 DISTRITO DE BARRANQUITA DE LA PROVINCIA DE LAMAS DEL DEPARTAMENTO DE SAN MARTÍN</w:t>
-      </w:r>
-    </w:p>
-    <w:p>
-      <w:pPr>
-        <w:spacing w:after="900" w:before="0" w:line="276"/>
-        <w:jc w:val="center"/>
-      </w:pPr>
-      <w:r>
-        <w:rPr>
-          <w:rFonts w:ascii="Arial" w:cs="Arial" w:eastAsia="Arial" w:hAnsi="Arial"/>
-          <w:b/>
-          <w:bCs/>
-          <w:sz w:val="24"/>
-          <w:szCs w:val="24"/>
-        </w:rPr>
-        <w:t xml:space="preserve">C.I. N.° 468901</w:t>
-      </w:r>
-    </w:p>
-    <w:p>
-      <w:pPr>
-        <w:spacing w:after="120" w:before="0" w:line="276"/>
-        <w:jc w:val="center"/>
-      </w:pPr>
-      <w:r>
-        <w:rPr>
-          <w:rFonts w:ascii="Arial" w:cs="Arial" w:eastAsia="Arial" w:hAnsi="Arial"/>
-          <w:sz w:val="20"/>
-          <w:szCs w:val="20"/>
-        </w:rPr>
-        <w:t xml:space="preserve">UBICACIÓN: SAN MARTIN - LAMAS - BARRANQUITA</w:t>
-      </w:r>
-    </w:p>
-    <w:p>
-      <w:pPr>
-        <w:spacing w:after="100" w:before="0" w:line="276"/>
-        <w:jc w:val="center"/>
-      </w:pPr>
-      <w:r>
-        <w:rPr>
-          <w:rFonts w:ascii="Arial" w:cs="Arial" w:eastAsia="Arial" w:hAnsi="Arial"/>
-          <w:b/>
-          <w:bCs/>
-          <w:sz w:val="20"/>
-          <w:szCs w:val="20"/>
         </w:rPr>
         <w:t xml:space="preserve">OCTUBRE 2026</w:t>
       </w:r>

</xml_diff>